<commit_message>
Knowledge - 5/9/2026 part 5
</commit_message>
<xml_diff>
--- a/Knowledge/3-Work knowledge/1-Software Engineering/1-Fundamentals/5-My Source/3-Network/12-Mobile Networks/1-Main Components of a Mobile Network/1-Examples of Mobile Devices/1-Smartphones.docx
+++ b/Knowledge/3-Work knowledge/1-Software Engineering/1-Fundamentals/5-My Source/3-Network/12-Mobile Networks/1-Main Components of a Mobile Network/1-Examples of Mobile Devices/1-Smartphones.docx
@@ -1737,198 +1737,267 @@
       </w:pPr>
       <w:r>
         <w:rPr>
-          <w:rFonts w:ascii="Arial" w:eastAsia="Arial" w:hAnsi="Arial" w:cs="Arial"/>
-          <w:b/>
-          <w:bCs/>
-          <w:sz w:val="18"/>
-          <w:szCs w:val="18"/>
+          <w:rFonts w:ascii="Arial" w:hAnsi="Arial"/>
+          <w:b/>
+          <w:sz w:val="18"/>
           <w:highlight w:val="lightGray"/>
         </w:rPr>
         <w:t xml:space="preserve"># Source: </w:t>
       </w:r>
-      <w:proofErr w:type="spellStart"/>
-      <w:r>
-        <w:rPr>
-          <w:rFonts w:ascii="Arial" w:eastAsia="Arial" w:hAnsi="Arial" w:cs="Arial"/>
-          <w:b/>
-          <w:bCs/>
-          <w:sz w:val="18"/>
-          <w:szCs w:val="18"/>
-          <w:highlight w:val="lightGray"/>
-        </w:rPr>
-        <w:t>ScreenShots</w:t>
-      </w:r>
-      <w:proofErr w:type="spellEnd"/>
-      <w:r>
-        <w:rPr>
-          <w:rFonts w:ascii="Arial" w:eastAsia="Arial" w:hAnsi="Arial" w:cs="Arial"/>
-          <w:sz w:val="18"/>
-          <w:szCs w:val="18"/>
+      <w:r>
+        <w:rPr>
+          <w:rFonts w:ascii="Arial" w:hAnsi="Arial" w:eastAsia="Arial" w:cs="Arial"/>
+          <w:b/>
+          <w:i w:val="0"/>
+          <w:color w:val="000000"/>
+          <w:sz w:val="18"/>
+          <w:highlight w:val="lightGray"/>
+        </w:rPr>
+        <w:t>S</w:t>
+      </w:r>
+      <w:r>
+        <w:rPr>
+          <w:rFonts w:ascii="Arial" w:hAnsi="Arial" w:eastAsia="Arial" w:cs="Arial"/>
+          <w:b/>
+          <w:i w:val="0"/>
+          <w:color w:val="000000"/>
+          <w:sz w:val="18"/>
+          <w:highlight w:val="lightGray"/>
+        </w:rPr>
+        <w:t>c</w:t>
+      </w:r>
+      <w:r>
+        <w:rPr>
+          <w:rFonts w:ascii="Arial" w:hAnsi="Arial" w:eastAsia="Arial" w:cs="Arial"/>
+          <w:b/>
+          <w:i w:val="0"/>
+          <w:color w:val="000000"/>
+          <w:sz w:val="18"/>
+          <w:highlight w:val="lightGray"/>
+        </w:rPr>
+        <w:t>r</w:t>
+      </w:r>
+      <w:r>
+        <w:rPr>
+          <w:rFonts w:ascii="Arial" w:hAnsi="Arial" w:eastAsia="Arial" w:cs="Arial"/>
+          <w:b/>
+          <w:i w:val="0"/>
+          <w:color w:val="000000"/>
+          <w:sz w:val="18"/>
+          <w:highlight w:val="lightGray"/>
+        </w:rPr>
+        <w:t>e</w:t>
+      </w:r>
+      <w:r>
+        <w:rPr>
+          <w:rFonts w:ascii="Arial" w:hAnsi="Arial" w:eastAsia="Arial" w:cs="Arial"/>
+          <w:b/>
+          <w:i w:val="0"/>
+          <w:color w:val="000000"/>
+          <w:sz w:val="18"/>
+          <w:highlight w:val="lightGray"/>
+        </w:rPr>
+        <w:t>e</w:t>
+      </w:r>
+      <w:r>
+        <w:rPr>
+          <w:rFonts w:ascii="Arial" w:hAnsi="Arial" w:eastAsia="Arial" w:cs="Arial"/>
+          <w:b/>
+          <w:i w:val="0"/>
+          <w:color w:val="000000"/>
+          <w:sz w:val="18"/>
+          <w:highlight w:val="lightGray"/>
+        </w:rPr>
+        <w:t>n</w:t>
+      </w:r>
+      <w:r>
+        <w:rPr>
+          <w:rFonts w:ascii="Arial" w:hAnsi="Arial" w:eastAsia="Arial" w:cs="Arial"/>
+          <w:b/>
+          <w:i w:val="0"/>
+          <w:color w:val="000000"/>
+          <w:sz w:val="18"/>
+          <w:highlight w:val="lightGray"/>
+        </w:rPr>
+        <w:t>S</w:t>
+      </w:r>
+      <w:r>
+        <w:rPr>
+          <w:rFonts w:ascii="Arial" w:hAnsi="Arial" w:eastAsia="Arial" w:cs="Arial"/>
+          <w:b/>
+          <w:i w:val="0"/>
+          <w:color w:val="000000"/>
+          <w:sz w:val="18"/>
+          <w:highlight w:val="lightGray"/>
+        </w:rPr>
+        <w:t>h</w:t>
+      </w:r>
+      <w:r>
+        <w:rPr>
+          <w:rFonts w:ascii="Arial" w:hAnsi="Arial" w:eastAsia="Arial" w:cs="Arial"/>
+          <w:b/>
+          <w:i w:val="0"/>
+          <w:color w:val="000000"/>
+          <w:sz w:val="18"/>
+          <w:highlight w:val="lightGray"/>
+        </w:rPr>
+        <w:t>o</w:t>
+      </w:r>
+      <w:r>
+        <w:rPr>
+          <w:rFonts w:ascii="Arial" w:hAnsi="Arial" w:eastAsia="Arial" w:cs="Arial"/>
+          <w:b/>
+          <w:i w:val="0"/>
+          <w:color w:val="000000"/>
+          <w:sz w:val="18"/>
+          <w:highlight w:val="lightGray"/>
+        </w:rPr>
+        <w:t>t</w:t>
+      </w:r>
+      <w:r>
+        <w:rPr>
+          <w:rFonts w:ascii="Arial" w:hAnsi="Arial"/>
+          <w:sz w:val="18"/>
           <w:highlight w:val="lightGray"/>
         </w:rPr>
         <w:t xml:space="preserve"> </w:t>
       </w:r>
       <w:r>
         <w:rPr>
-          <w:rFonts w:ascii="Arial" w:eastAsia="Arial" w:hAnsi="Arial" w:cs="Arial"/>
-          <w:b/>
-          <w:bCs/>
-          <w:sz w:val="18"/>
-          <w:szCs w:val="18"/>
+          <w:rFonts w:ascii="Arial" w:hAnsi="Arial"/>
+          <w:b/>
+          <w:sz w:val="18"/>
           <w:highlight w:val="lightGray"/>
         </w:rPr>
         <w:t>Source</w:t>
       </w:r>
       <w:r>
         <w:rPr>
-          <w:rFonts w:ascii="Arial" w:eastAsia="Arial" w:hAnsi="Arial" w:cs="Arial"/>
-          <w:sz w:val="18"/>
-          <w:szCs w:val="18"/>
+          <w:rFonts w:ascii="Arial" w:hAnsi="Arial"/>
+          <w:sz w:val="18"/>
           <w:highlight w:val="lightGray"/>
         </w:rPr>
         <w:t xml:space="preserve">: </w:t>
       </w:r>
       <w:r>
         <w:rPr>
-          <w:rFonts w:ascii="Arial" w:eastAsia="Arial" w:hAnsi="Arial" w:cs="Arial"/>
-          <w:b/>
-          <w:bCs/>
-          <w:sz w:val="18"/>
-          <w:szCs w:val="18"/>
+          <w:rFonts w:ascii="Arial" w:hAnsi="Arial"/>
+          <w:b/>
+          <w:sz w:val="18"/>
           <w:highlight w:val="lightGray"/>
         </w:rPr>
         <w:t>Provided by:</w:t>
       </w:r>
       <w:r>
         <w:rPr>
-          <w:rFonts w:ascii="Arial" w:eastAsia="Arial" w:hAnsi="Arial" w:cs="Arial"/>
-          <w:sz w:val="18"/>
-          <w:szCs w:val="18"/>
+          <w:rFonts w:ascii="Arial" w:hAnsi="Arial"/>
+          <w:sz w:val="18"/>
           <w:highlight w:val="lightGray"/>
         </w:rPr>
         <w:t xml:space="preserve"> [Persons Table -&gt; ID Column: 1, </w:t>
       </w:r>
-      <w:proofErr w:type="spellStart"/>
-      <w:r>
-        <w:rPr>
-          <w:rFonts w:ascii="Arial" w:eastAsia="Arial" w:hAnsi="Arial" w:cs="Arial"/>
-          <w:sz w:val="18"/>
-          <w:szCs w:val="18"/>
+      <w:r>
+        <w:rPr>
+          <w:rFonts w:ascii="Arial" w:hAnsi="Arial"/>
+          <w:sz w:val="18"/>
           <w:highlight w:val="lightGray"/>
         </w:rPr>
         <w:t>Name_En</w:t>
       </w:r>
-      <w:proofErr w:type="spellEnd"/>
-      <w:r>
-        <w:rPr>
-          <w:rFonts w:ascii="Arial" w:eastAsia="Arial" w:hAnsi="Arial" w:cs="Arial"/>
-          <w:sz w:val="18"/>
-          <w:szCs w:val="18"/>
+      <w:r>
+        <w:rPr>
+          <w:rFonts w:ascii="Arial" w:hAnsi="Arial"/>
+          <w:sz w:val="18"/>
           <w:highlight w:val="lightGray"/>
         </w:rPr>
         <w:t xml:space="preserve"> Column: Motasem Essam] -&gt; </w:t>
       </w:r>
       <w:r>
         <w:rPr>
-          <w:rFonts w:ascii="Arial" w:eastAsia="Arial" w:hAnsi="Arial" w:cs="Arial"/>
-          <w:b/>
-          <w:bCs/>
-          <w:sz w:val="18"/>
-          <w:szCs w:val="18"/>
+          <w:rFonts w:ascii="Arial" w:hAnsi="Arial"/>
+          <w:b/>
+          <w:sz w:val="18"/>
           <w:highlight w:val="lightGray"/>
         </w:rPr>
         <w:t>Tool:</w:t>
       </w:r>
       <w:r>
         <w:rPr>
-          <w:rFonts w:ascii="Arial" w:eastAsia="Arial" w:hAnsi="Arial" w:cs="Arial"/>
-          <w:sz w:val="18"/>
-          <w:szCs w:val="18"/>
+          <w:rFonts w:ascii="Arial" w:hAnsi="Arial"/>
+          <w:sz w:val="18"/>
           <w:highlight w:val="lightGray"/>
         </w:rPr>
         <w:t xml:space="preserve"> [</w:t>
       </w:r>
-      <w:proofErr w:type="spellStart"/>
-      <w:r>
-        <w:rPr>
-          <w:rFonts w:ascii="Arial" w:eastAsia="Arial" w:hAnsi="Arial" w:cs="Arial"/>
-          <w:sz w:val="18"/>
-          <w:szCs w:val="18"/>
+      <w:r>
+        <w:rPr>
+          <w:rFonts w:ascii="Arial" w:hAnsi="Arial"/>
+          <w:sz w:val="18"/>
           <w:highlight w:val="lightGray"/>
         </w:rPr>
         <w:t>Lightshot</w:t>
       </w:r>
-      <w:proofErr w:type="spellEnd"/>
-      <w:r>
-        <w:rPr>
-          <w:rFonts w:ascii="Arial" w:eastAsia="Arial" w:hAnsi="Arial" w:cs="Arial"/>
-          <w:sz w:val="18"/>
-          <w:szCs w:val="18"/>
+      <w:r>
+        <w:rPr>
+          <w:rFonts w:ascii="Arial" w:hAnsi="Arial"/>
+          <w:sz w:val="18"/>
           <w:highlight w:val="lightGray"/>
         </w:rPr>
         <w:t xml:space="preserve"> Program] -&gt; </w:t>
       </w:r>
       <w:r>
         <w:rPr>
-          <w:rFonts w:ascii="Arial" w:eastAsia="Arial" w:hAnsi="Arial" w:cs="Arial"/>
-          <w:b/>
-          <w:bCs/>
-          <w:sz w:val="18"/>
-          <w:szCs w:val="18"/>
+          <w:rFonts w:ascii="Arial" w:hAnsi="Arial"/>
+          <w:b/>
+          <w:sz w:val="18"/>
           <w:highlight w:val="lightGray"/>
         </w:rPr>
         <w:t xml:space="preserve">From </w:t>
       </w:r>
       <w:r>
         <w:rPr>
-          <w:rFonts w:ascii="Arial" w:eastAsia="Arial" w:hAnsi="Arial" w:cs="Arial"/>
-          <w:sz w:val="18"/>
-          <w:szCs w:val="18"/>
+          <w:rFonts w:ascii="Arial" w:hAnsi="Arial"/>
+          <w:sz w:val="18"/>
           <w:highlight w:val="lightGray"/>
         </w:rPr>
         <w:t>[Site: Google Search: Images</w:t>
       </w:r>
       <w:r>
         <w:rPr>
-          <w:rFonts w:ascii="Arial" w:eastAsia="Arial" w:hAnsi="Arial" w:cs="Arial"/>
-          <w:sz w:val="18"/>
-          <w:szCs w:val="18"/>
+          <w:rFonts w:ascii="Arial" w:hAnsi="Arial"/>
+          <w:sz w:val="18"/>
           <w:highlight w:val="lightGray"/>
         </w:rPr>
         <w:t>: Smartphones</w:t>
       </w:r>
       <w:r>
         <w:rPr>
-          <w:rFonts w:ascii="Arial" w:eastAsia="Arial" w:hAnsi="Arial" w:cs="Arial"/>
-          <w:sz w:val="18"/>
-          <w:szCs w:val="18"/>
+          <w:rFonts w:ascii="Arial" w:hAnsi="Arial"/>
+          <w:sz w:val="18"/>
           <w:highlight w:val="lightGray"/>
         </w:rPr>
         <w:t xml:space="preserve">] </w:t>
       </w:r>
       <w:r>
         <w:rPr>
-          <w:rFonts w:ascii="Arial" w:eastAsia="Arial" w:hAnsi="Arial" w:cs="Arial"/>
-          <w:b/>
-          <w:bCs/>
-          <w:sz w:val="18"/>
-          <w:szCs w:val="18"/>
+          <w:rFonts w:ascii="Arial" w:hAnsi="Arial"/>
+          <w:b/>
+          <w:sz w:val="18"/>
           <w:highlight w:val="lightGray"/>
         </w:rPr>
         <w:t>on</w:t>
       </w:r>
       <w:r>
         <w:rPr>
-          <w:rFonts w:ascii="Arial" w:eastAsia="Arial" w:hAnsi="Arial" w:cs="Arial"/>
-          <w:sz w:val="18"/>
-          <w:szCs w:val="18"/>
+          <w:rFonts w:ascii="Arial" w:hAnsi="Arial"/>
+          <w:sz w:val="18"/>
           <w:highlight w:val="lightGray"/>
         </w:rPr>
         <w:t xml:space="preserve"> [</w:t>
       </w:r>
       <w:r>
         <w:rPr>
-          <w:rFonts w:ascii="Arial" w:eastAsia="Arial" w:hAnsi="Arial"/>
+          <w:rFonts w:ascii="Arial" w:hAnsi="Arial"/>
           <w:color w:val="000000"/>
           <w:sz w:val="18"/>
           <w:highlight w:val="lightGray"/>
@@ -1937,9 +2006,8 @@
       </w:r>
       <w:r>
         <w:rPr>
-          <w:rFonts w:ascii="Arial" w:eastAsia="Arial" w:hAnsi="Arial" w:cs="Arial"/>
-          <w:sz w:val="18"/>
-          <w:szCs w:val="18"/>
+          <w:rFonts w:ascii="Arial" w:hAnsi="Arial"/>
+          <w:sz w:val="18"/>
           <w:highlight w:val="lightGray"/>
         </w:rPr>
         <w:t>]</w:t>

</xml_diff>